<commit_message>
add final proposal version
</commit_message>
<xml_diff>
--- a/drafts/ecologyLetters_submission/CNP_npMeta_ELprop_v1.0.docx
+++ b/drafts/ecologyLetters_submission/CNP_npMeta_ELprop_v1.0.docx
@@ -47,7 +47,10 @@
     </w:p>
     <w:p>
       <w:r>
-        <w:t>July 1</w:t>
+        <w:t xml:space="preserve">July </w:t>
+      </w:r>
+      <w:r>
+        <w:t>2</w:t>
       </w:r>
       <w:r>
         <w:t>, 2026</w:t>
@@ -145,13 +148,31 @@
         <w:t xml:space="preserve"> these interactions for only a few whole-plant traits </w:t>
       </w:r>
       <w:r>
-        <w:t>relevant for terrestrial biosphere modeling, restricting their ability to provide an empirical basis for improving model performance and reliability. To address this gap, we compiled 5,680 observations from 90 full-factorial N by P supply experiments worldwide. We used this dataset to quantify the individual and interactive effects of N and P addition on 19 leaf and whole-plant variables that are directly relevant for assessing model performance and reliability</w:t>
+        <w:t xml:space="preserve">relevant for terrestrial biosphere modeling, restricting their ability to provide an empirical </w:t>
+      </w:r>
+      <w:r>
+        <w:t xml:space="preserve">and theoretical </w:t>
+      </w:r>
+      <w:r>
+        <w:t>basis for improving model performance and reliability. To address this gap, we compiled 5,680 observations from 90 full-factorial N</w:t>
+      </w:r>
+      <w:r>
+        <w:t>-</w:t>
+      </w:r>
+      <w:r>
+        <w:t>by</w:t>
+      </w:r>
+      <w:r>
+        <w:t>-</w:t>
+      </w:r>
+      <w:r>
+        <w:t>P supply experiments worldwide. We used this dataset to quantify the individual and interactive effects of N and P addition on 19 leaf and whole-plant variables that are directly relevant for assessing model performance and reliability</w:t>
       </w:r>
       <w:r>
         <w:t xml:space="preserve"> and refining ecophysiological theory</w:t>
       </w:r>
       <w:r>
-        <w:t xml:space="preserve">. </w:t>
+        <w:t>.</w:t>
       </w:r>
     </w:p>
     <w:p>
@@ -173,7 +194,35 @@
         <w:sdtContent/>
       </w:sdt>
       <w:r>
-        <w:t>Second, interaction effect sizes indicated largely additive leaf-level responses to combined N and P addition, highlighting the idea that N and P play distinct and largely independent roles on leaf nutrient and photosynthetic processes. Third, our synthesis shows strong climate controls on leaf nutrient responses to nutrient enrichment that support the idea that environments with greater photosynthetic demand for soil resources (i.e., cold, dry, and bright environments) experience stronger leaf nutrient responses to nutrient addition. These patterns highlight the utility of including climate-based frameworks for predicting photosynthetic investment in models. Fourth, our results show that nutrient acquisition strategies may be more informative than photosynthetic pathway when modeling plant responses to nutrient availability.</w:t>
+        <w:t>Second, interaction effect sizes indicated largely additive leaf-level responses to combined N and P addition, highlighting the idea that N and P play distinct and independent roles on leaf nutrient and photosynthetic processes. Third, our synthesis shows strong climate controls on leaf nutrient responses to nutrient enrichment</w:t>
+      </w:r>
+      <w:r>
+        <w:t>,</w:t>
+      </w:r>
+      <w:r>
+        <w:t xml:space="preserve"> support</w:t>
+      </w:r>
+      <w:r>
+        <w:t>ing</w:t>
+      </w:r>
+      <w:r>
+        <w:t xml:space="preserve"> the idea that environments with greater photosynthetic demand for soil resources (i.e., cold, dry, and bright environments) experience stronger responses to nutrient addition. These patterns highlight the utility of including climate-based frameworks for predicting photosynthetic investment in models. Fourth, our results show that nutrient acquisition strateg</w:t>
+      </w:r>
+      <w:r>
+        <w:t xml:space="preserve">y is </w:t>
+      </w:r>
+      <w:r>
+        <w:t>more informative than photosynthetic pathway when modeling plant responses to nutrient availability</w:t>
+      </w:r>
+      <w:r>
+        <w:t xml:space="preserve">, supporting the inclusion and further development of acquisition strategy-explicit frameworks in </w:t>
+      </w:r>
+      <w:r>
+        <w:lastRenderedPageBreak/>
+        <w:t>models</w:t>
+      </w:r>
+      <w:r>
+        <w:t>.</w:t>
       </w:r>
       <w:sdt>
         <w:sdtPr>
@@ -186,11 +235,68 @@
         <w:t xml:space="preserve"> </w:t>
       </w:r>
       <w:r>
-        <w:t xml:space="preserve">Overall, this synthesis provides strong empirical support for an emerging </w:t>
-      </w:r>
-      <w:r>
-        <w:lastRenderedPageBreak/>
-        <w:t xml:space="preserve">ecophysiological-grounded theoretical framework for C-N-P cycling, which in turn provides a basis for improving the representation of nutrient cycles in vegetation and land-surface models. We believe this </w:t>
+        <w:t xml:space="preserve">Overall, this synthesis provides strong empirical support for an emerging ecophysiological-grounded theoretical framework for C-N-P cycling, which in turn provides a basis for improving the representation of nutrient cycles in </w:t>
+      </w:r>
+      <w:r>
+        <w:t>terrestrial biosphere</w:t>
+      </w:r>
+      <w:r>
+        <w:t xml:space="preserve"> models.</w:t>
+      </w:r>
+    </w:p>
+    <w:p>
+      <w:r>
+        <w:t xml:space="preserve">This work is a direct follow-up from a recently published </w:t>
+      </w:r>
+      <w:r>
+        <w:rPr>
+          <w:i/>
+          <w:iCs/>
+        </w:rPr>
+        <w:t>Tansley Review</w:t>
+      </w:r>
+      <w:r>
+        <w:t xml:space="preserve"> in </w:t>
+      </w:r>
+      <w:r>
+        <w:rPr>
+          <w:i/>
+          <w:iCs/>
+        </w:rPr>
+        <w:t>New Phytologist</w:t>
+      </w:r>
+      <w:r>
+        <w:t xml:space="preserve"> that was just recognized</w:t>
+      </w:r>
+      <w:r>
+        <w:t xml:space="preserve"> by the journal</w:t>
+      </w:r>
+      <w:r>
+        <w:t xml:space="preserve"> as </w:t>
+      </w:r>
+      <w:r>
+        <w:t xml:space="preserve">being </w:t>
+      </w:r>
+      <w:r>
+        <w:t>one of the top 10 most viewed articles for 2025, with many of the same co-authors present in this synthesis</w:t>
+      </w:r>
+      <w:r>
+        <w:t xml:space="preserve"> (Stocker et al., 2025)</w:t>
+      </w:r>
+      <w:r>
+        <w:t xml:space="preserve">. </w:t>
+      </w:r>
+      <w:r>
+        <w:t xml:space="preserve">Given this and the novel insights this synthesis provides, we firmly </w:t>
+      </w:r>
+      <w:r>
+        <w:t xml:space="preserve">believe </w:t>
+      </w:r>
+      <w:r>
+        <w:t xml:space="preserve">that </w:t>
+      </w:r>
+      <w:r>
+        <w:t xml:space="preserve">this </w:t>
       </w:r>
       <w:r>
         <w:t xml:space="preserve">synthesis </w:t>
@@ -201,7 +307,13 @@
     </w:p>
     <w:p>
       <w:r>
-        <w:t xml:space="preserve">Thank you for considering this proposal. We would be happy to submit this manuscript as a </w:t>
+        <w:t>Thank you for considering this proposal.</w:t>
+      </w:r>
+      <w:r>
+        <w:t xml:space="preserve"> </w:t>
+      </w:r>
+      <w:r>
+        <w:t xml:space="preserve">We would be happy to submit this manuscript as a </w:t>
       </w:r>
       <w:r>
         <w:rPr>
@@ -211,7 +323,35 @@
         <w:t>Letter</w:t>
       </w:r>
       <w:r>
-        <w:t xml:space="preserve"> if the editorial team deems this article type more suitable and are interested in submitting this manuscript for consideration in the </w:t>
+        <w:t xml:space="preserve"> </w:t>
+      </w:r>
+      <w:r>
+        <w:t xml:space="preserve">or </w:t>
+      </w:r>
+      <w:r>
+        <w:rPr>
+          <w:i/>
+          <w:iCs/>
+        </w:rPr>
+        <w:t>Perspective</w:t>
+      </w:r>
+      <w:r>
+        <w:t xml:space="preserve"> </w:t>
+      </w:r>
+      <w:r>
+        <w:t>if the editorial team deems th</w:t>
+      </w:r>
+      <w:r>
+        <w:t>ese</w:t>
+      </w:r>
+      <w:r>
+        <w:t xml:space="preserve"> article type</w:t>
+      </w:r>
+      <w:r>
+        <w:t>s</w:t>
+      </w:r>
+      <w:r>
+        <w:t xml:space="preserve"> more suitable and are interested in submitting this manuscript for consideration in the </w:t>
       </w:r>
       <w:r>
         <w:rPr>
@@ -238,45 +378,168 @@
     <w:p>
       <w:r>
         <w:t>Sincerely,</w:t>
-      </w:r>
-    </w:p>
-    <w:p/>
-    <w:p>
-      <w:r>
-        <w:t>Evan A. Perkowski, Ph.D.</w:t>
-      </w:r>
-    </w:p>
-    <w:p>
-      <w:pPr>
-        <w:rPr>
-          <w:i/>
-          <w:iCs/>
-        </w:rPr>
-      </w:pPr>
-      <w:r>
-        <w:rPr>
-          <w:i/>
-          <w:iCs/>
-        </w:rPr>
-        <w:t xml:space="preserve">On behalf of </w:t>
-      </w:r>
-      <w:r>
-        <w:rPr>
-          <w:i/>
-          <w:iCs/>
-        </w:rPr>
-        <w:t xml:space="preserve">manuscript </w:t>
-      </w:r>
-      <w:r>
-        <w:rPr>
-          <w:i/>
-          <w:iCs/>
-        </w:rPr>
-        <w:t>co-authors</w:t>
       </w:r>
     </w:p>
     <w:p/>
     <w:p/>
+    <w:p>
+      <w:r>
+        <w:t>Evan A. Perkowski, Ph.D.</w:t>
+      </w:r>
+    </w:p>
+    <w:p>
+      <w:pPr>
+        <w:rPr>
+          <w:i/>
+          <w:iCs/>
+        </w:rPr>
+      </w:pPr>
+      <w:r>
+        <w:rPr>
+          <w:i/>
+          <w:iCs/>
+        </w:rPr>
+        <w:t>On behalf of co-authors</w:t>
+      </w:r>
+      <w:r>
+        <w:rPr>
+          <w:i/>
+          <w:iCs/>
+        </w:rPr>
+        <w:t xml:space="preserve"> </w:t>
+      </w:r>
+      <w:proofErr w:type="spellStart"/>
+      <w:r>
+        <w:rPr>
+          <w:i/>
+          <w:iCs/>
+          <w:color w:val="000000"/>
+        </w:rPr>
+        <w:t>Alissar</w:t>
+      </w:r>
+      <w:proofErr w:type="spellEnd"/>
+      <w:r>
+        <w:rPr>
+          <w:i/>
+          <w:iCs/>
+          <w:color w:val="000000"/>
+        </w:rPr>
+        <w:t xml:space="preserve"> Cheaib, Monika R. Kelley, Jan A. </w:t>
+      </w:r>
+      <w:proofErr w:type="spellStart"/>
+      <w:r>
+        <w:rPr>
+          <w:i/>
+          <w:iCs/>
+          <w:color w:val="000000"/>
+        </w:rPr>
+        <w:t>Lankhorst</w:t>
+      </w:r>
+      <w:proofErr w:type="spellEnd"/>
+      <w:r>
+        <w:rPr>
+          <w:i/>
+          <w:iCs/>
+          <w:color w:val="000000"/>
+        </w:rPr>
+        <w:t xml:space="preserve">, Astrid </w:t>
+      </w:r>
+      <w:proofErr w:type="spellStart"/>
+      <w:r>
+        <w:rPr>
+          <w:i/>
+          <w:iCs/>
+          <w:color w:val="000000"/>
+        </w:rPr>
+        <w:t>Odé</w:t>
+      </w:r>
+      <w:proofErr w:type="spellEnd"/>
+      <w:r>
+        <w:rPr>
+          <w:i/>
+          <w:iCs/>
+          <w:color w:val="000000"/>
+        </w:rPr>
+        <w:t xml:space="preserve">, Daniil J.P. Scheifes, Huiying Xu, Daisy </w:t>
+      </w:r>
+      <w:proofErr w:type="spellStart"/>
+      <w:r>
+        <w:rPr>
+          <w:i/>
+          <w:iCs/>
+          <w:color w:val="000000"/>
+        </w:rPr>
+        <w:t>Cárate-Tandalla</w:t>
+      </w:r>
+      <w:proofErr w:type="spellEnd"/>
+      <w:r>
+        <w:rPr>
+          <w:i/>
+          <w:iCs/>
+          <w:color w:val="000000"/>
+        </w:rPr>
+        <w:t>, Hugo J. de Boer, Ning Dong, Benjamin D. Stocker, Karin T. Rebel, I. Colin Prentice, Sandy P. Harrison, and Nicholas G. Smith</w:t>
+      </w:r>
+    </w:p>
+    <w:p/>
+    <w:p>
+      <w:pPr>
+        <w:spacing w:line="276" w:lineRule="auto"/>
+        <w:rPr>
+          <w:b/>
+          <w:bCs/>
+        </w:rPr>
+      </w:pPr>
+      <w:r>
+        <w:rPr>
+          <w:b/>
+          <w:bCs/>
+        </w:rPr>
+        <w:t>References</w:t>
+      </w:r>
+    </w:p>
+    <w:p>
+      <w:pPr>
+        <w:spacing w:after="0" w:line="276" w:lineRule="auto"/>
+        <w:rPr>
+          <w:lang w:val="en-US" w:eastAsia="en-US"/>
+        </w:rPr>
+      </w:pPr>
+      <w:r>
+        <w:rPr>
+          <w:lang w:val="en-US" w:eastAsia="en-US"/>
+        </w:rPr>
+        <w:t xml:space="preserve">Stocker, B.D., Dong, N., Perkowski, E.A., Schneider, P.D., Xu, H., de Boer, H.J., </w:t>
+      </w:r>
+      <w:r>
+        <w:rPr>
+          <w:i/>
+          <w:iCs/>
+          <w:lang w:val="en-US" w:eastAsia="en-US"/>
+        </w:rPr>
+        <w:t>et al.</w:t>
+      </w:r>
+      <w:r>
+        <w:rPr>
+          <w:lang w:val="en-US" w:eastAsia="en-US"/>
+        </w:rPr>
+        <w:t xml:space="preserve"> (2025). Empirical evidence and theoretical understanding of ecosystem carbon and nitrogen cycle interactions. </w:t>
+      </w:r>
+      <w:r>
+        <w:rPr>
+          <w:i/>
+          <w:iCs/>
+          <w:lang w:val="en-US" w:eastAsia="en-US"/>
+        </w:rPr>
+        <w:t>New Phytologist</w:t>
+      </w:r>
+      <w:r>
+        <w:rPr>
+          <w:lang w:val="en-US" w:eastAsia="en-US"/>
+        </w:rPr>
+        <w:t>, 245, 49–68.</w:t>
+      </w:r>
+    </w:p>
     <w:p/>
     <w:p/>
     <w:p/>

</xml_diff>